<commit_message>
US spelling: dioptre -> diopter across CMS E2 + PD2 E1 (pools, guides, chart, masters, Arcade, cram)
check_us_spelling.py lacked the word, so the Semester 2 sweep reported 0 while 29
instances remained; added dioptre/dioptres to its map. Same-length swap, so no
length-bias change. Group Study and the 4 affected .docx exports regenerated.

Co-Authored-By: Claude Opus 5.5 (1M context) <noreply@anthropic.com>
</commit_message>
<xml_diff>
--- a/Clinical Medicine and Surgery I Exam 2/cms-ophtho-comparison-chart.docx
+++ b/Clinical Medicine and Surgery I Exam 2/cms-ophtho-comparison-chart.docx
@@ -25867,7 +25867,7 @@
                 <w:i w:val="0"/>
                 <w:sz w:val="18"/>
               </w:rPr>
-              <w:t>Concave (negative dioptre) lens</w:t>
+              <w:t>Concave (negative diopter) lens</w:t>
             </w:r>
             <w:r>
               <w:rPr>
@@ -26216,7 +26216,7 @@
                 <w:i w:val="0"/>
                 <w:sz w:val="18"/>
               </w:rPr>
-              <w:t>Convex (positive dioptre) lens</w:t>
+              <w:t>Convex (positive diopter) lens</w:t>
             </w:r>
             <w:r>
               <w:rPr>

</xml_diff>